<commit_message>
WIP - obsługa tabeli
</commit_message>
<xml_diff>
--- a/public/dofinansowanie.docx
+++ b/public/dofinansowanie.docx
@@ -1,8 +1,8 @@
 
 <file path=word/document.xml><?xml version="1.0" encoding="utf-8"?>
-<w:document xmlns:wpc="http://schemas.microsoft.com/office/word/2010/wordprocessingCanvas" xmlns:cx="http://schemas.microsoft.com/office/drawing/2014/chartex" xmlns:cx1="http://schemas.microsoft.com/office/drawing/2015/9/8/chartex" xmlns:cx2="http://schemas.microsoft.com/office/drawing/2015/10/21/chartex" xmlns:cx3="http://schemas.microsoft.com/office/drawing/2016/5/9/chartex" xmlns:cx4="http://schemas.microsoft.com/office/drawing/2016/5/10/chartex" xmlns:cx5="http://schemas.microsoft.com/office/drawing/2016/5/11/chartex" xmlns:cx6="http://schemas.microsoft.com/office/drawing/2016/5/12/chartex" xmlns:cx7="http://schemas.microsoft.com/office/drawing/2016/5/13/chartex" xmlns:cx8="http://schemas.microsoft.com/office/drawing/2016/5/14/chartex" xmlns:mc="http://schemas.openxmlformats.org/markup-compatibility/2006" xmlns:m="http://schemas.openxmlformats.org/officeDocument/2006/math" xmlns:aink="http://schemas.microsoft.com/office/drawing/2016/ink" xmlns:am3d="http://schemas.microsoft.com/office/drawing/2017/model3d" xmlns:oel="http://schemas.microsoft.com/office/2019/extlst" xmlns:r="http://schemas.openxmlformats.org/officeDocument/2006/relationships" xmlns:wp14="http://schemas.microsoft.com/office/word/2010/wordprocessingDrawing" xmlns:wp="http://schemas.openxmlformats.org/drawingml/2006/wordprocessingDrawing" xmlns:wpg="http://schemas.microsoft.com/office/word/2010/wordprocessingGroup" xmlns:wpi="http://schemas.microsoft.com/office/word/2010/wordprocessingInk" xmlns:wps="http://schemas.microsoft.com/office/word/2010/wordprocessingShape" xmlns:o="urn:schemas-microsoft-com:office:office" xmlns:v="urn:schemas-microsoft-com:vml" xmlns:w10="urn:schemas-microsoft-com:office:word" xmlns:w="http://schemas.openxmlformats.org/wordprocessingml/2006/main" xmlns:w14="http://schemas.microsoft.com/office/word/2010/wordml" xmlns:w15="http://schemas.microsoft.com/office/word/2012/wordml" xmlns:w16cex="http://schemas.microsoft.com/office/word/2018/wordml/cex" xmlns:w16cid="http://schemas.microsoft.com/office/word/2016/wordml/cid" xmlns:w16="http://schemas.microsoft.com/office/word/2018/wordml" xmlns:w16sdtdh="http://schemas.microsoft.com/office/word/2020/wordml/sdtdatahash" xmlns:w16sdtfl="http://schemas.microsoft.com/office/word/2024/wordml/sdtformatlock" xmlns:w16se="http://schemas.microsoft.com/office/word/2015/wordml/symex" xmlns:w16du="http://schemas.microsoft.com/office/word/2023/wordml/word16du" xmlns:wne="http://schemas.microsoft.com/office/word/2006/wordml" mc:Ignorable="w14 w15 w16se w16cid w16 w16cex w16sdtdh w16sdtfl w16du wp14">
+<w:document xmlns:ns1="http://schemas.openxmlformats.org/markup-compatibility/2006" xmlns:ns2="http://schemas.microsoft.com/office/word/2010/wordml" xmlns:ns3="http://schemas.openxmlformats.org/officeDocument/2006/relationships" xmlns:w="http://schemas.openxmlformats.org/wordprocessingml/2006/main" ns1:Ignorable="w14 w15 w16se w16cid w16 w16cex w16sdtdh w16sdtfl w16du wp14">
   <w:body>
-    <w:p>
+    <w:p ns2:paraId="2C0D7C72" ns2:textId="5867296E">
       <w:pPr>
         <w:pageBreakBefore/>
         <w:widowControl w:val="0"/>
@@ -51,7 +51,7 @@
         <w:t>2023 r.</w:t>
       </w:r>
     </w:p>
-    <w:p>
+    <w:p ns2:paraId="65B5C65C" ns2:textId="77777777">
       <w:pPr>
         <w:tabs>
           <w:tab w:val="left" w:pos="7598"/>
@@ -62,7 +62,7 @@
         <w:jc w:val="right"/>
       </w:pPr>
     </w:p>
-    <w:p>
+    <w:p ns2:paraId="48862CCC" ns2:textId="53749E05">
       <w:pPr>
         <w:tabs>
           <w:tab w:val="left" w:pos="7598"/>
@@ -134,7 +134,7 @@
         <w:t>}</w:t>
       </w:r>
     </w:p>
-    <w:p>
+    <w:p ns2:paraId="5E716C38" ns2:textId="77777777">
       <w:pPr>
         <w:ind w:firstLine="6"/>
         <w:rPr>
@@ -152,7 +152,7 @@
         <w:t>Prorektor ds. Studenckich</w:t>
       </w:r>
     </w:p>
-    <w:p>
+    <w:p ns2:paraId="40517F94" ns2:textId="77777777">
       <w:pPr>
         <w:ind w:firstLine="6"/>
         <w:rPr>
@@ -170,7 +170,7 @@
         <w:t>Zachodniopomorski Uniwersytet Technologiczny w Szczecinie</w:t>
       </w:r>
     </w:p>
-    <w:p>
+    <w:p ns2:paraId="14E0F6E8" ns2:textId="59CB8106">
       <w:pPr>
         <w:spacing w:before="240" w:line="276" w:lineRule="auto"/>
         <w:jc w:val="center"/>
@@ -191,7 +191,7 @@
         <w:t>WNIOSEK</w:t>
       </w:r>
     </w:p>
-    <w:p>
+    <w:p ns2:paraId="156CE51F" ns2:textId="77777777">
       <w:pPr>
         <w:spacing w:line="360" w:lineRule="auto"/>
         <w:jc w:val="both"/>
@@ -210,7 +210,7 @@
         <w:t>(wypełnić drukowanymi literami)</w:t>
       </w:r>
     </w:p>
-    <w:p>
+    <w:p ns2:paraId="0D9E8AA4" ns2:textId="1AAF3787">
       <w:pPr>
         <w:tabs>
           <w:tab w:val="left" w:pos="907"/>
@@ -266,7 +266,7 @@
         <w:t>}</w:t>
       </w:r>
     </w:p>
-    <w:p>
+    <w:p ns2:paraId="334F31F5" ns2:textId="7A8C7C9E">
       <w:pPr>
         <w:tabs>
           <w:tab w:val="left" w:leader="dot" w:pos="9639"/>
@@ -287,7 +287,7 @@
         <w:t>(nazwa uczelnianej organizacji)</w:t>
       </w:r>
     </w:p>
-    <w:p>
+    <w:p ns2:paraId="003C56BB" ns2:textId="05C6DFFB">
       <w:pPr>
         <w:tabs>
           <w:tab w:val="left" w:pos="5103"/>
@@ -348,7 +348,7 @@
         <w:tab/>
       </w:r>
     </w:p>
-    <w:p>
+    <w:p ns2:paraId="25D7E56E" ns2:textId="3CE1A9F9">
       <w:pPr>
         <w:tabs>
           <w:tab w:val="left" w:pos="2977"/>
@@ -403,7 +403,7 @@
         <w:tab/>
       </w:r>
     </w:p>
-    <w:p>
+    <w:p ns2:paraId="668967DB" ns2:textId="77777777">
       <w:pPr>
         <w:tabs>
           <w:tab w:val="left" w:leader="dot" w:pos="9639"/>
@@ -421,7 +421,7 @@
         <w:tab/>
       </w:r>
     </w:p>
-    <w:p>
+    <w:p ns2:paraId="40621BF1" ns2:textId="527061A0">
       <w:pPr>
         <w:pStyle w:val="Akapitzlist"/>
         <w:numPr>
@@ -475,7 +475,7 @@
         <w:tab/>
       </w:r>
     </w:p>
-    <w:p>
+    <w:p ns2:paraId="0ED6CF29" ns2:textId="77777777">
       <w:pPr>
         <w:tabs>
           <w:tab w:val="left" w:pos="284"/>
@@ -495,7 +495,7 @@
         <w:tab/>
       </w:r>
     </w:p>
-    <w:p>
+    <w:p ns2:paraId="61D60CDE" ns2:textId="77777777">
       <w:pPr>
         <w:tabs>
           <w:tab w:val="left" w:pos="284"/>
@@ -515,7 +515,7 @@
         <w:tab/>
       </w:r>
     </w:p>
-    <w:p>
+    <w:p ns2:paraId="6BB88A98" ns2:textId="77777777">
       <w:pPr>
         <w:tabs>
           <w:tab w:val="left" w:pos="284"/>
@@ -535,7 +535,7 @@
         <w:tab/>
       </w:r>
     </w:p>
-    <w:p>
+    <w:p ns2:paraId="21A9E347" ns2:textId="77777777">
       <w:pPr>
         <w:tabs>
           <w:tab w:val="left" w:pos="284"/>
@@ -555,7 +555,7 @@
         <w:tab/>
       </w:r>
     </w:p>
-    <w:p>
+    <w:p ns2:paraId="0D80F097" ns2:textId="77777777">
       <w:pPr>
         <w:tabs>
           <w:tab w:val="left" w:pos="284"/>
@@ -575,7 +575,7 @@
         <w:tab/>
       </w:r>
     </w:p>
-    <w:p>
+    <w:p ns2:paraId="269A8382" ns2:textId="5A6FC344">
       <w:pPr>
         <w:pStyle w:val="Akapitzlist"/>
         <w:numPr>
@@ -629,7 +629,7 @@
         <w:tab/>
       </w:r>
     </w:p>
-    <w:p>
+    <w:p ns2:paraId="10B3E3FA" ns2:textId="77777777">
       <w:pPr>
         <w:pStyle w:val="Akapitzlist"/>
         <w:tabs>
@@ -650,7 +650,7 @@
         <w:tab/>
       </w:r>
     </w:p>
-    <w:p>
+    <w:p ns2:paraId="603DA7D0" ns2:textId="29B19007">
       <w:pPr>
         <w:pStyle w:val="Akapitzlist"/>
         <w:numPr>
@@ -729,7 +729,7 @@
         <w:t>*</w:t>
       </w:r>
     </w:p>
-    <w:p>
+    <w:p ns2:paraId="385BC708" ns2:textId="19835AC1">
       <w:pPr>
         <w:pStyle w:val="Akapitzlist"/>
         <w:numPr>
@@ -783,7 +783,7 @@
         <w:tab/>
       </w:r>
     </w:p>
-    <w:p>
+    <w:p ns2:paraId="33EF4A09" ns2:textId="1221EE7C">
       <w:pPr>
         <w:pStyle w:val="Akapitzlist"/>
         <w:numPr>
@@ -850,7 +850,7 @@
         <w:tab/>
       </w:r>
     </w:p>
-    <w:p>
+    <w:p ns2:paraId="7DF803B9" ns2:textId="40FC36AC">
       <w:pPr>
         <w:pStyle w:val="Akapitzlist"/>
         <w:numPr>
@@ -904,7 +904,7 @@
         <w:tab/>
       </w:r>
     </w:p>
-    <w:p>
+    <w:p ns2:paraId="2EB3C2D9" ns2:textId="0EC84031">
       <w:pPr>
         <w:pStyle w:val="Akapitzlist"/>
         <w:numPr>
@@ -958,7 +958,7 @@
         <w:tab/>
       </w:r>
     </w:p>
-    <w:p>
+    <w:p ns2:paraId="4146D560" ns2:textId="7A698C83">
       <w:pPr>
         <w:pStyle w:val="Akapitzlist"/>
         <w:tabs>
@@ -1040,7 +1040,7 @@
         <w:tab/>
       </w:r>
     </w:p>
-    <w:p>
+    <w:p ns2:paraId="74A574BB" ns2:textId="2367F058">
       <w:pPr>
         <w:pStyle w:val="Akapitzlist"/>
         <w:numPr>
@@ -1094,7 +1094,7 @@
         <w:tab/>
       </w:r>
     </w:p>
-    <w:p>
+    <w:p ns2:paraId="52655C5B" ns2:textId="4555B6CE">
       <w:pPr>
         <w:tabs>
           <w:tab w:val="left" w:pos="284"/>
@@ -1160,7 +1160,7 @@
         <w:tab/>
       </w:r>
     </w:p>
-    <w:p>
+    <w:p ns2:paraId="1594EA40" ns2:textId="4C15EF2B">
       <w:pPr>
         <w:tabs>
           <w:tab w:val="left" w:pos="6521"/>
@@ -1357,7 +1357,7 @@
         <w:t>)</w:t>
       </w:r>
     </w:p>
-    <w:p>
+    <w:p ns2:paraId="2E39170A" ns2:textId="54FA0B83">
       <w:pPr>
         <w:tabs>
           <w:tab w:val="left" w:leader="dot" w:pos="9639"/>
@@ -1413,7 +1413,7 @@
         <w:t xml:space="preserve">organizacji studenckiej. </w:t>
       </w:r>
     </w:p>
-    <w:p>
+    <w:p ns2:paraId="075B20F7" ns2:textId="7CEBBBB1">
       <w:pPr>
         <w:tabs>
           <w:tab w:val="left" w:leader="dot" w:pos="9639"/>
@@ -1484,7 +1484,7 @@
         <w:t>.</w:t>
       </w:r>
     </w:p>
-    <w:p>
+    <w:p ns2:paraId="4853C4C1" ns2:textId="0FE2B58A">
       <w:pPr>
         <w:tabs>
           <w:tab w:val="left" w:leader="dot" w:pos="9639"/>
@@ -1509,7 +1509,7 @@
         <w:t>………………………………………………………</w:t>
       </w:r>
     </w:p>
-    <w:p>
+    <w:p ns2:paraId="35035CAE" ns2:textId="7194F1FB">
       <w:pPr>
         <w:tabs>
           <w:tab w:val="left" w:leader="dot" w:pos="9639"/>
@@ -1555,7 +1555,7 @@
         <w:t xml:space="preserve"> dziekana wydziału </w:t>
       </w:r>
     </w:p>
-    <w:p>
+    <w:p ns2:paraId="0E64919C" ns2:textId="7A1421FE">
       <w:pPr>
         <w:tabs>
           <w:tab w:val="left" w:leader="dot" w:pos="9639"/>
@@ -1585,7 +1585,7 @@
         <w:t>)</w:t>
       </w:r>
     </w:p>
-    <w:p>
+    <w:p ns2:paraId="3FAA211D" ns2:textId="5D431796">
       <w:pPr>
         <w:tabs>
           <w:tab w:val="left" w:leader="dot" w:pos="9639"/>
@@ -1611,7 +1611,7 @@
         <w:t>Decyzja</w:t>
       </w:r>
     </w:p>
-    <w:p>
+    <w:p ns2:paraId="7CC52E3F" ns2:textId="77777777">
       <w:pPr>
         <w:tabs>
           <w:tab w:val="left" w:pos="1843"/>
@@ -1658,7 +1658,7 @@
         <w:tab/>
       </w:r>
     </w:p>
-    <w:p>
+    <w:p ns2:paraId="338C297D" ns2:textId="77777777">
       <w:pPr>
         <w:tabs>
           <w:tab w:val="left" w:leader="dot" w:pos="9639"/>
@@ -1683,7 +1683,7 @@
         <w:tab/>
       </w:r>
     </w:p>
-    <w:p>
+    <w:p ns2:paraId="23206AF7" ns2:textId="77777777">
       <w:pPr>
         <w:tabs>
           <w:tab w:val="left" w:leader="dot" w:pos="9639"/>
@@ -1708,7 +1708,7 @@
         <w:tab/>
       </w:r>
     </w:p>
-    <w:p>
+    <w:p ns2:paraId="7EDC3DAB" ns2:textId="77777777">
       <w:pPr>
         <w:tabs>
           <w:tab w:val="left" w:pos="5954"/>
@@ -1738,7 +1738,7 @@
         <w:tab/>
       </w:r>
     </w:p>
-    <w:p>
+    <w:p ns2:paraId="6236D157" ns2:textId="48190299">
       <w:pPr>
         <w:ind w:left="4536"/>
         <w:jc w:val="center"/>
@@ -1773,7 +1773,7 @@
         <w:t>prorektora ds. studenckich)</w:t>
       </w:r>
     </w:p>
-    <w:p>
+    <w:p ns2:paraId="6C09D922" ns2:textId="77777777">
       <w:pPr>
         <w:jc w:val="both"/>
         <w:rPr>
@@ -1791,7 +1791,7 @@
         <w:t>* Niepotrzebne skreślić</w:t>
       </w:r>
     </w:p>
-    <w:p>
+    <w:p ns2:paraId="1F635BDA" ns2:textId="77777777">
       <w:pPr>
         <w:pStyle w:val="Nagwek1"/>
         <w:pageBreakBefore/>
@@ -1811,7 +1811,7 @@
         <w:t>Kosztorys zadania</w:t>
       </w:r>
     </w:p>
-    <w:p>
+    <w:p ns2:paraId="0BF0981A" ns2:textId="1B0C8740">
       <w:pPr>
         <w:tabs>
           <w:tab w:val="left" w:pos="4536"/>
@@ -1841,7 +1841,7 @@
         <w:t xml:space="preserve"> </w:t>
       </w:r>
     </w:p>
-    <w:p>
+    <w:p ns2:paraId="2807C409" ns2:textId="4EAEBBDB">
       <w:pPr>
         <w:tabs>
           <w:tab w:val="left" w:pos="0"/>
@@ -1886,7 +1886,7 @@
         <w:tab/>
       </w:r>
     </w:p>
-    <w:p>
+    <w:p ns2:paraId="4CF855A6" ns2:textId="77777777">
       <w:pPr>
         <w:spacing w:line="360" w:lineRule="auto"/>
         <w:rPr>
@@ -1904,7 +1904,7 @@
         <w:t>organizowanego przez:</w:t>
       </w:r>
     </w:p>
-    <w:p>
+    <w:p ns2:paraId="6DFAACF9" ns2:textId="08E328B7">
       <w:pPr>
         <w:tabs>
           <w:tab w:val="left" w:leader="dot" w:pos="9922"/>
@@ -1947,7 +1947,7 @@
         <w:tab/>
       </w:r>
     </w:p>
-    <w:p>
+    <w:p ns2:paraId="44CACD55" ns2:textId="77777777">
       <w:pPr>
         <w:jc w:val="center"/>
         <w:rPr>
@@ -1961,7 +1961,7 @@
         <w:t>(nazwa uczelnianej organizacji)</w:t>
       </w:r>
     </w:p>
-    <w:p>
+    <w:p ns2:paraId="71B8BB94" ns2:textId="77777777">
       <w:pPr>
         <w:rPr>
           <w:rFonts w:asciiTheme="minorHAnsi" w:hAnsiTheme="minorHAnsi" w:cstheme="minorHAnsi"/>
@@ -1991,7 +1991,7 @@
         <w:gridCol w:w="1635"/>
         <w:gridCol w:w="1388"/>
       </w:tblGrid>
-      <w:tr>
+      <w:tr ns2:paraId="24D1CE20" ns2:textId="77777777">
         <w:trPr>
           <w:trHeight w:val="515"/>
           <w:tblHeader/>
@@ -2005,7 +2005,7 @@
             <w:shd w:val="clear" w:color="auto" w:fill="F2F2F2" w:themeFill="background1" w:themeFillShade="F2"/>
             <w:vAlign w:val="center"/>
           </w:tcPr>
-          <w:p>
+          <w:p ns2:paraId="570114BA" ns2:textId="77777777">
             <w:pPr>
               <w:jc w:val="center"/>
               <w:rPr>
@@ -2026,7 +2026,7 @@
             <w:shd w:val="clear" w:color="auto" w:fill="F2F2F2" w:themeFill="background1" w:themeFillShade="F2"/>
             <w:vAlign w:val="center"/>
           </w:tcPr>
-          <w:p>
+          <w:p ns2:paraId="5F84F611" ns2:textId="77777777">
             <w:pPr>
               <w:jc w:val="center"/>
               <w:rPr>
@@ -2047,7 +2047,7 @@
             <w:shd w:val="clear" w:color="auto" w:fill="F2F2F2" w:themeFill="background1" w:themeFillShade="F2"/>
             <w:vAlign w:val="center"/>
           </w:tcPr>
-          <w:p>
+          <w:p ns2:paraId="0AE0C37E" ns2:textId="77777777">
             <w:pPr>
               <w:jc w:val="center"/>
               <w:rPr>
@@ -2068,7 +2068,7 @@
             <w:shd w:val="clear" w:color="auto" w:fill="F2F2F2" w:themeFill="background1" w:themeFillShade="F2"/>
             <w:vAlign w:val="center"/>
           </w:tcPr>
-          <w:p>
+          <w:p ns2:paraId="6BB88007" ns2:textId="77777777">
             <w:pPr>
               <w:jc w:val="center"/>
               <w:rPr>
@@ -2089,7 +2089,7 @@
             <w:shd w:val="clear" w:color="auto" w:fill="F2F2F2" w:themeFill="background1" w:themeFillShade="F2"/>
             <w:vAlign w:val="center"/>
           </w:tcPr>
-          <w:p>
+          <w:p ns2:paraId="201482C8" ns2:textId="77777777">
             <w:pPr>
               <w:jc w:val="center"/>
               <w:rPr>
@@ -2110,7 +2110,7 @@
             <w:shd w:val="clear" w:color="auto" w:fill="F2F2F2" w:themeFill="background1" w:themeFillShade="F2"/>
             <w:vAlign w:val="center"/>
           </w:tcPr>
-          <w:p>
+          <w:p ns2:paraId="4DE9FE69" ns2:textId="77777777">
             <w:pPr>
               <w:jc w:val="center"/>
               <w:rPr>
@@ -2126,7 +2126,7 @@
           </w:p>
         </w:tc>
       </w:tr>
-      <w:tr>
+      <w:tr ns2:paraId="3DB8E62D" ns2:textId="77777777">
         <w:trPr>
           <w:trHeight w:val="340"/>
         </w:trPr>
@@ -2136,7 +2136,7 @@
             <w:shd w:val="clear" w:color="auto" w:fill="F2F2F2" w:themeFill="background1" w:themeFillShade="F2"/>
             <w:vAlign w:val="center"/>
           </w:tcPr>
-          <w:p>
+          <w:p ns2:paraId="1FDD5C25" ns2:textId="77777777">
             <w:pPr>
               <w:jc w:val="center"/>
               <w:rPr>
@@ -2144,10 +2144,7 @@
               </w:rPr>
             </w:pPr>
             <w:r>
-              <w:rPr>
-                <w:rFonts w:asciiTheme="minorHAnsi" w:hAnsiTheme="minorHAnsi" w:cstheme="minorHAnsi"/>
-              </w:rPr>
-              <w:t>1.</w:t>
+              <w:t>{#koszty}{lp}</w:t>
             </w:r>
           </w:p>
         </w:tc>
@@ -2156,13 +2153,16 @@
             <w:tcW w:w="4060" w:type="dxa"/>
             <w:vAlign w:val="center"/>
           </w:tcPr>
-          <w:p>
+          <w:p ns2:paraId="0A24CBF7" ns2:textId="77777777">
             <w:pPr>
               <w:jc w:val="center"/>
               <w:rPr>
                 <w:rFonts w:asciiTheme="minorHAnsi" w:hAnsiTheme="minorHAnsi" w:cstheme="minorHAnsi"/>
               </w:rPr>
             </w:pPr>
+            <w:r>
+              <w:t>{opis}</w:t>
+            </w:r>
           </w:p>
         </w:tc>
         <w:tc>
@@ -2170,13 +2170,16 @@
             <w:tcW w:w="928" w:type="dxa"/>
             <w:vAlign w:val="center"/>
           </w:tcPr>
-          <w:p>
+          <w:p ns2:paraId="40B17203" ns2:textId="77777777">
             <w:pPr>
               <w:jc w:val="center"/>
               <w:rPr>
                 <w:rFonts w:asciiTheme="minorHAnsi" w:hAnsiTheme="minorHAnsi" w:cstheme="minorHAnsi"/>
               </w:rPr>
             </w:pPr>
+            <w:r>
+              <w:t>{ilosc}</w:t>
+            </w:r>
           </w:p>
         </w:tc>
         <w:tc>
@@ -2184,13 +2187,16 @@
             <w:tcW w:w="1623" w:type="dxa"/>
             <w:vAlign w:val="center"/>
           </w:tcPr>
-          <w:p>
+          <w:p ns2:paraId="726FA82A" ns2:textId="77777777">
             <w:pPr>
               <w:jc w:val="center"/>
               <w:rPr>
                 <w:rFonts w:asciiTheme="minorHAnsi" w:hAnsiTheme="minorHAnsi" w:cstheme="minorHAnsi"/>
               </w:rPr>
             </w:pPr>
+            <w:r>
+              <w:t>{cena_jednostkowa}</w:t>
+            </w:r>
           </w:p>
         </w:tc>
         <w:tc>
@@ -2198,13 +2204,16 @@
             <w:tcW w:w="1312" w:type="dxa"/>
             <w:vAlign w:val="center"/>
           </w:tcPr>
-          <w:p>
+          <w:p ns2:paraId="4093539C" ns2:textId="77777777">
             <w:pPr>
               <w:jc w:val="center"/>
               <w:rPr>
                 <w:rFonts w:asciiTheme="minorHAnsi" w:hAnsiTheme="minorHAnsi" w:cstheme="minorHAnsi"/>
               </w:rPr>
             </w:pPr>
+            <w:r>
+              <w:t>{kwota}</w:t>
+            </w:r>
           </w:p>
         </w:tc>
         <w:tc>
@@ -2212,17 +2221,20 @@
             <w:tcW w:w="1396" w:type="dxa"/>
             <w:vAlign w:val="center"/>
           </w:tcPr>
-          <w:p>
+          <w:p ns2:paraId="6EFB675A" ns2:textId="77777777">
             <w:pPr>
               <w:jc w:val="center"/>
               <w:rPr>
                 <w:rFonts w:asciiTheme="minorHAnsi" w:hAnsiTheme="minorHAnsi" w:cstheme="minorHAnsi"/>
               </w:rPr>
             </w:pPr>
+            <w:r>
+              <w:t>{zrodlo_finansowania}{/koszty}</w:t>
+            </w:r>
           </w:p>
         </w:tc>
       </w:tr>
-      <w:tr>
+      <w:tr ns2:paraId="2C0C69FD" ns2:textId="77777777">
         <w:trPr>
           <w:trHeight w:val="340"/>
         </w:trPr>
@@ -2232,586 +2244,7 @@
             <w:shd w:val="clear" w:color="auto" w:fill="F2F2F2" w:themeFill="background1" w:themeFillShade="F2"/>
             <w:vAlign w:val="center"/>
           </w:tcPr>
-          <w:p>
-            <w:pPr>
-              <w:jc w:val="center"/>
-              <w:rPr>
-                <w:rFonts w:asciiTheme="minorHAnsi" w:hAnsiTheme="minorHAnsi" w:cstheme="minorHAnsi"/>
-              </w:rPr>
-            </w:pPr>
-            <w:r>
-              <w:rPr>
-                <w:rFonts w:asciiTheme="minorHAnsi" w:hAnsiTheme="minorHAnsi" w:cstheme="minorHAnsi"/>
-              </w:rPr>
-              <w:t>2.</w:t>
-            </w:r>
-          </w:p>
-        </w:tc>
-        <w:tc>
-          <w:tcPr>
-            <w:tcW w:w="4060" w:type="dxa"/>
-            <w:vAlign w:val="center"/>
-          </w:tcPr>
-          <w:p>
-            <w:pPr>
-              <w:jc w:val="center"/>
-              <w:rPr>
-                <w:rFonts w:asciiTheme="minorHAnsi" w:hAnsiTheme="minorHAnsi" w:cstheme="minorHAnsi"/>
-              </w:rPr>
-            </w:pPr>
-          </w:p>
-        </w:tc>
-        <w:tc>
-          <w:tcPr>
-            <w:tcW w:w="928" w:type="dxa"/>
-            <w:vAlign w:val="center"/>
-          </w:tcPr>
-          <w:p>
-            <w:pPr>
-              <w:jc w:val="center"/>
-              <w:rPr>
-                <w:rFonts w:asciiTheme="minorHAnsi" w:hAnsiTheme="minorHAnsi" w:cstheme="minorHAnsi"/>
-              </w:rPr>
-            </w:pPr>
-          </w:p>
-        </w:tc>
-        <w:tc>
-          <w:tcPr>
-            <w:tcW w:w="1623" w:type="dxa"/>
-            <w:vAlign w:val="center"/>
-          </w:tcPr>
-          <w:p>
-            <w:pPr>
-              <w:jc w:val="center"/>
-              <w:rPr>
-                <w:rFonts w:asciiTheme="minorHAnsi" w:hAnsiTheme="minorHAnsi" w:cstheme="minorHAnsi"/>
-              </w:rPr>
-            </w:pPr>
-          </w:p>
-        </w:tc>
-        <w:tc>
-          <w:tcPr>
-            <w:tcW w:w="1312" w:type="dxa"/>
-            <w:vAlign w:val="center"/>
-          </w:tcPr>
-          <w:p>
-            <w:pPr>
-              <w:jc w:val="center"/>
-              <w:rPr>
-                <w:rFonts w:asciiTheme="minorHAnsi" w:hAnsiTheme="minorHAnsi" w:cstheme="minorHAnsi"/>
-              </w:rPr>
-            </w:pPr>
-          </w:p>
-        </w:tc>
-        <w:tc>
-          <w:tcPr>
-            <w:tcW w:w="1396" w:type="dxa"/>
-            <w:vAlign w:val="center"/>
-          </w:tcPr>
-          <w:p>
-            <w:pPr>
-              <w:jc w:val="center"/>
-              <w:rPr>
-                <w:rFonts w:asciiTheme="minorHAnsi" w:hAnsiTheme="minorHAnsi" w:cstheme="minorHAnsi"/>
-              </w:rPr>
-            </w:pPr>
-          </w:p>
-        </w:tc>
-      </w:tr>
-      <w:tr>
-        <w:trPr>
-          <w:trHeight w:val="340"/>
-        </w:trPr>
-        <w:tc>
-          <w:tcPr>
-            <w:tcW w:w="535" w:type="dxa"/>
-            <w:shd w:val="clear" w:color="auto" w:fill="F2F2F2" w:themeFill="background1" w:themeFillShade="F2"/>
-            <w:vAlign w:val="center"/>
-          </w:tcPr>
-          <w:p>
-            <w:pPr>
-              <w:jc w:val="center"/>
-              <w:rPr>
-                <w:rFonts w:asciiTheme="minorHAnsi" w:hAnsiTheme="minorHAnsi" w:cstheme="minorHAnsi"/>
-              </w:rPr>
-            </w:pPr>
-            <w:r>
-              <w:rPr>
-                <w:rFonts w:asciiTheme="minorHAnsi" w:hAnsiTheme="minorHAnsi" w:cstheme="minorHAnsi"/>
-              </w:rPr>
-              <w:t>3.</w:t>
-            </w:r>
-          </w:p>
-        </w:tc>
-        <w:tc>
-          <w:tcPr>
-            <w:tcW w:w="4060" w:type="dxa"/>
-            <w:vAlign w:val="center"/>
-          </w:tcPr>
-          <w:p>
-            <w:pPr>
-              <w:jc w:val="center"/>
-              <w:rPr>
-                <w:rFonts w:asciiTheme="minorHAnsi" w:hAnsiTheme="minorHAnsi" w:cstheme="minorHAnsi"/>
-              </w:rPr>
-            </w:pPr>
-          </w:p>
-        </w:tc>
-        <w:tc>
-          <w:tcPr>
-            <w:tcW w:w="928" w:type="dxa"/>
-            <w:vAlign w:val="center"/>
-          </w:tcPr>
-          <w:p>
-            <w:pPr>
-              <w:jc w:val="center"/>
-              <w:rPr>
-                <w:rFonts w:asciiTheme="minorHAnsi" w:hAnsiTheme="minorHAnsi" w:cstheme="minorHAnsi"/>
-              </w:rPr>
-            </w:pPr>
-          </w:p>
-        </w:tc>
-        <w:tc>
-          <w:tcPr>
-            <w:tcW w:w="1623" w:type="dxa"/>
-            <w:vAlign w:val="center"/>
-          </w:tcPr>
-          <w:p>
-            <w:pPr>
-              <w:jc w:val="center"/>
-              <w:rPr>
-                <w:rFonts w:asciiTheme="minorHAnsi" w:hAnsiTheme="minorHAnsi" w:cstheme="minorHAnsi"/>
-              </w:rPr>
-            </w:pPr>
-          </w:p>
-        </w:tc>
-        <w:tc>
-          <w:tcPr>
-            <w:tcW w:w="1312" w:type="dxa"/>
-            <w:vAlign w:val="center"/>
-          </w:tcPr>
-          <w:p>
-            <w:pPr>
-              <w:jc w:val="center"/>
-              <w:rPr>
-                <w:rFonts w:asciiTheme="minorHAnsi" w:hAnsiTheme="minorHAnsi" w:cstheme="minorHAnsi"/>
-              </w:rPr>
-            </w:pPr>
-          </w:p>
-        </w:tc>
-        <w:tc>
-          <w:tcPr>
-            <w:tcW w:w="1396" w:type="dxa"/>
-            <w:vAlign w:val="center"/>
-          </w:tcPr>
-          <w:p>
-            <w:pPr>
-              <w:jc w:val="center"/>
-              <w:rPr>
-                <w:rFonts w:asciiTheme="minorHAnsi" w:hAnsiTheme="minorHAnsi" w:cstheme="minorHAnsi"/>
-              </w:rPr>
-            </w:pPr>
-          </w:p>
-        </w:tc>
-      </w:tr>
-      <w:tr>
-        <w:trPr>
-          <w:trHeight w:val="340"/>
-        </w:trPr>
-        <w:tc>
-          <w:tcPr>
-            <w:tcW w:w="535" w:type="dxa"/>
-            <w:shd w:val="clear" w:color="auto" w:fill="F2F2F2" w:themeFill="background1" w:themeFillShade="F2"/>
-            <w:vAlign w:val="center"/>
-          </w:tcPr>
-          <w:p>
-            <w:pPr>
-              <w:jc w:val="center"/>
-              <w:rPr>
-                <w:rFonts w:asciiTheme="minorHAnsi" w:hAnsiTheme="minorHAnsi" w:cstheme="minorHAnsi"/>
-              </w:rPr>
-            </w:pPr>
-            <w:r>
-              <w:rPr>
-                <w:rFonts w:asciiTheme="minorHAnsi" w:hAnsiTheme="minorHAnsi" w:cstheme="minorHAnsi"/>
-              </w:rPr>
-              <w:t>4.</w:t>
-            </w:r>
-          </w:p>
-        </w:tc>
-        <w:tc>
-          <w:tcPr>
-            <w:tcW w:w="4060" w:type="dxa"/>
-            <w:vAlign w:val="center"/>
-          </w:tcPr>
-          <w:p>
-            <w:pPr>
-              <w:jc w:val="center"/>
-              <w:rPr>
-                <w:rFonts w:asciiTheme="minorHAnsi" w:hAnsiTheme="minorHAnsi" w:cstheme="minorHAnsi"/>
-              </w:rPr>
-            </w:pPr>
-          </w:p>
-        </w:tc>
-        <w:tc>
-          <w:tcPr>
-            <w:tcW w:w="928" w:type="dxa"/>
-            <w:vAlign w:val="center"/>
-          </w:tcPr>
-          <w:p>
-            <w:pPr>
-              <w:jc w:val="center"/>
-              <w:rPr>
-                <w:rFonts w:asciiTheme="minorHAnsi" w:hAnsiTheme="minorHAnsi" w:cstheme="minorHAnsi"/>
-              </w:rPr>
-            </w:pPr>
-          </w:p>
-        </w:tc>
-        <w:tc>
-          <w:tcPr>
-            <w:tcW w:w="1623" w:type="dxa"/>
-            <w:vAlign w:val="center"/>
-          </w:tcPr>
-          <w:p>
-            <w:pPr>
-              <w:jc w:val="center"/>
-              <w:rPr>
-                <w:rFonts w:asciiTheme="minorHAnsi" w:hAnsiTheme="minorHAnsi" w:cstheme="minorHAnsi"/>
-              </w:rPr>
-            </w:pPr>
-          </w:p>
-        </w:tc>
-        <w:tc>
-          <w:tcPr>
-            <w:tcW w:w="1312" w:type="dxa"/>
-            <w:vAlign w:val="center"/>
-          </w:tcPr>
-          <w:p>
-            <w:pPr>
-              <w:jc w:val="center"/>
-              <w:rPr>
-                <w:rFonts w:asciiTheme="minorHAnsi" w:hAnsiTheme="minorHAnsi" w:cstheme="minorHAnsi"/>
-              </w:rPr>
-            </w:pPr>
-          </w:p>
-        </w:tc>
-        <w:tc>
-          <w:tcPr>
-            <w:tcW w:w="1396" w:type="dxa"/>
-            <w:vAlign w:val="center"/>
-          </w:tcPr>
-          <w:p>
-            <w:pPr>
-              <w:jc w:val="center"/>
-              <w:rPr>
-                <w:rFonts w:asciiTheme="minorHAnsi" w:hAnsiTheme="minorHAnsi" w:cstheme="minorHAnsi"/>
-              </w:rPr>
-            </w:pPr>
-          </w:p>
-        </w:tc>
-      </w:tr>
-      <w:tr>
-        <w:trPr>
-          <w:trHeight w:val="340"/>
-        </w:trPr>
-        <w:tc>
-          <w:tcPr>
-            <w:tcW w:w="535" w:type="dxa"/>
-            <w:shd w:val="clear" w:color="auto" w:fill="F2F2F2" w:themeFill="background1" w:themeFillShade="F2"/>
-            <w:vAlign w:val="center"/>
-          </w:tcPr>
-          <w:p>
-            <w:pPr>
-              <w:jc w:val="center"/>
-              <w:rPr>
-                <w:rFonts w:asciiTheme="minorHAnsi" w:hAnsiTheme="minorHAnsi" w:cstheme="minorHAnsi"/>
-              </w:rPr>
-            </w:pPr>
-            <w:r>
-              <w:rPr>
-                <w:rFonts w:asciiTheme="minorHAnsi" w:hAnsiTheme="minorHAnsi" w:cstheme="minorHAnsi"/>
-              </w:rPr>
-              <w:t>5.</w:t>
-            </w:r>
-          </w:p>
-        </w:tc>
-        <w:tc>
-          <w:tcPr>
-            <w:tcW w:w="4060" w:type="dxa"/>
-            <w:vAlign w:val="center"/>
-          </w:tcPr>
-          <w:p>
-            <w:pPr>
-              <w:jc w:val="center"/>
-              <w:rPr>
-                <w:rFonts w:asciiTheme="minorHAnsi" w:hAnsiTheme="minorHAnsi" w:cstheme="minorHAnsi"/>
-              </w:rPr>
-            </w:pPr>
-          </w:p>
-        </w:tc>
-        <w:tc>
-          <w:tcPr>
-            <w:tcW w:w="928" w:type="dxa"/>
-            <w:vAlign w:val="center"/>
-          </w:tcPr>
-          <w:p>
-            <w:pPr>
-              <w:jc w:val="center"/>
-              <w:rPr>
-                <w:rFonts w:asciiTheme="minorHAnsi" w:hAnsiTheme="minorHAnsi" w:cstheme="minorHAnsi"/>
-              </w:rPr>
-            </w:pPr>
-          </w:p>
-        </w:tc>
-        <w:tc>
-          <w:tcPr>
-            <w:tcW w:w="1623" w:type="dxa"/>
-            <w:vAlign w:val="center"/>
-          </w:tcPr>
-          <w:p>
-            <w:pPr>
-              <w:jc w:val="center"/>
-              <w:rPr>
-                <w:rFonts w:asciiTheme="minorHAnsi" w:hAnsiTheme="minorHAnsi" w:cstheme="minorHAnsi"/>
-              </w:rPr>
-            </w:pPr>
-          </w:p>
-        </w:tc>
-        <w:tc>
-          <w:tcPr>
-            <w:tcW w:w="1312" w:type="dxa"/>
-            <w:vAlign w:val="center"/>
-          </w:tcPr>
-          <w:p>
-            <w:pPr>
-              <w:jc w:val="center"/>
-              <w:rPr>
-                <w:rFonts w:asciiTheme="minorHAnsi" w:hAnsiTheme="minorHAnsi" w:cstheme="minorHAnsi"/>
-              </w:rPr>
-            </w:pPr>
-          </w:p>
-        </w:tc>
-        <w:tc>
-          <w:tcPr>
-            <w:tcW w:w="1396" w:type="dxa"/>
-            <w:vAlign w:val="center"/>
-          </w:tcPr>
-          <w:p>
-            <w:pPr>
-              <w:jc w:val="center"/>
-              <w:rPr>
-                <w:rFonts w:asciiTheme="minorHAnsi" w:hAnsiTheme="minorHAnsi" w:cstheme="minorHAnsi"/>
-              </w:rPr>
-            </w:pPr>
-          </w:p>
-        </w:tc>
-      </w:tr>
-      <w:tr>
-        <w:trPr>
-          <w:trHeight w:val="340"/>
-        </w:trPr>
-        <w:tc>
-          <w:tcPr>
-            <w:tcW w:w="535" w:type="dxa"/>
-            <w:shd w:val="clear" w:color="auto" w:fill="F2F2F2" w:themeFill="background1" w:themeFillShade="F2"/>
-            <w:vAlign w:val="center"/>
-          </w:tcPr>
-          <w:p>
-            <w:pPr>
-              <w:jc w:val="center"/>
-              <w:rPr>
-                <w:rFonts w:asciiTheme="minorHAnsi" w:hAnsiTheme="minorHAnsi" w:cstheme="minorHAnsi"/>
-              </w:rPr>
-            </w:pPr>
-            <w:r>
-              <w:rPr>
-                <w:rFonts w:asciiTheme="minorHAnsi" w:hAnsiTheme="minorHAnsi" w:cstheme="minorHAnsi"/>
-              </w:rPr>
-              <w:t>6.</w:t>
-            </w:r>
-          </w:p>
-        </w:tc>
-        <w:tc>
-          <w:tcPr>
-            <w:tcW w:w="4060" w:type="dxa"/>
-            <w:vAlign w:val="center"/>
-          </w:tcPr>
-          <w:p>
-            <w:pPr>
-              <w:jc w:val="center"/>
-              <w:rPr>
-                <w:rFonts w:asciiTheme="minorHAnsi" w:hAnsiTheme="minorHAnsi" w:cstheme="minorHAnsi"/>
-              </w:rPr>
-            </w:pPr>
-          </w:p>
-        </w:tc>
-        <w:tc>
-          <w:tcPr>
-            <w:tcW w:w="928" w:type="dxa"/>
-            <w:vAlign w:val="center"/>
-          </w:tcPr>
-          <w:p>
-            <w:pPr>
-              <w:jc w:val="center"/>
-              <w:rPr>
-                <w:rFonts w:asciiTheme="minorHAnsi" w:hAnsiTheme="minorHAnsi" w:cstheme="minorHAnsi"/>
-              </w:rPr>
-            </w:pPr>
-          </w:p>
-        </w:tc>
-        <w:tc>
-          <w:tcPr>
-            <w:tcW w:w="1623" w:type="dxa"/>
-            <w:vAlign w:val="center"/>
-          </w:tcPr>
-          <w:p>
-            <w:pPr>
-              <w:jc w:val="center"/>
-              <w:rPr>
-                <w:rFonts w:asciiTheme="minorHAnsi" w:hAnsiTheme="minorHAnsi" w:cstheme="minorHAnsi"/>
-              </w:rPr>
-            </w:pPr>
-          </w:p>
-        </w:tc>
-        <w:tc>
-          <w:tcPr>
-            <w:tcW w:w="1312" w:type="dxa"/>
-            <w:vAlign w:val="center"/>
-          </w:tcPr>
-          <w:p>
-            <w:pPr>
-              <w:jc w:val="center"/>
-              <w:rPr>
-                <w:rFonts w:asciiTheme="minorHAnsi" w:hAnsiTheme="minorHAnsi" w:cstheme="minorHAnsi"/>
-              </w:rPr>
-            </w:pPr>
-          </w:p>
-        </w:tc>
-        <w:tc>
-          <w:tcPr>
-            <w:tcW w:w="1396" w:type="dxa"/>
-            <w:vAlign w:val="center"/>
-          </w:tcPr>
-          <w:p>
-            <w:pPr>
-              <w:jc w:val="center"/>
-              <w:rPr>
-                <w:rFonts w:asciiTheme="minorHAnsi" w:hAnsiTheme="minorHAnsi" w:cstheme="minorHAnsi"/>
-              </w:rPr>
-            </w:pPr>
-          </w:p>
-        </w:tc>
-      </w:tr>
-      <w:tr>
-        <w:trPr>
-          <w:trHeight w:val="340"/>
-        </w:trPr>
-        <w:tc>
-          <w:tcPr>
-            <w:tcW w:w="535" w:type="dxa"/>
-            <w:shd w:val="clear" w:color="auto" w:fill="F2F2F2" w:themeFill="background1" w:themeFillShade="F2"/>
-            <w:vAlign w:val="center"/>
-          </w:tcPr>
-          <w:p>
-            <w:pPr>
-              <w:jc w:val="center"/>
-              <w:rPr>
-                <w:rFonts w:asciiTheme="minorHAnsi" w:hAnsiTheme="minorHAnsi" w:cstheme="minorHAnsi"/>
-              </w:rPr>
-            </w:pPr>
-            <w:r>
-              <w:rPr>
-                <w:rFonts w:asciiTheme="minorHAnsi" w:hAnsiTheme="minorHAnsi" w:cstheme="minorHAnsi"/>
-              </w:rPr>
-              <w:t>7.</w:t>
-            </w:r>
-          </w:p>
-        </w:tc>
-        <w:tc>
-          <w:tcPr>
-            <w:tcW w:w="4060" w:type="dxa"/>
-            <w:tcBorders>
-              <w:bottom w:val="single" w:sz="4" w:space="0" w:color="000000"/>
-            </w:tcBorders>
-            <w:vAlign w:val="center"/>
-          </w:tcPr>
-          <w:p>
-            <w:pPr>
-              <w:jc w:val="center"/>
-              <w:rPr>
-                <w:rFonts w:asciiTheme="minorHAnsi" w:hAnsiTheme="minorHAnsi" w:cstheme="minorHAnsi"/>
-              </w:rPr>
-            </w:pPr>
-          </w:p>
-        </w:tc>
-        <w:tc>
-          <w:tcPr>
-            <w:tcW w:w="928" w:type="dxa"/>
-            <w:vAlign w:val="center"/>
-          </w:tcPr>
-          <w:p>
-            <w:pPr>
-              <w:jc w:val="center"/>
-              <w:rPr>
-                <w:rFonts w:asciiTheme="minorHAnsi" w:hAnsiTheme="minorHAnsi" w:cstheme="minorHAnsi"/>
-              </w:rPr>
-            </w:pPr>
-          </w:p>
-        </w:tc>
-        <w:tc>
-          <w:tcPr>
-            <w:tcW w:w="1623" w:type="dxa"/>
-            <w:vAlign w:val="center"/>
-          </w:tcPr>
-          <w:p>
-            <w:pPr>
-              <w:jc w:val="center"/>
-              <w:rPr>
-                <w:rFonts w:asciiTheme="minorHAnsi" w:hAnsiTheme="minorHAnsi" w:cstheme="minorHAnsi"/>
-              </w:rPr>
-            </w:pPr>
-          </w:p>
-        </w:tc>
-        <w:tc>
-          <w:tcPr>
-            <w:tcW w:w="1312" w:type="dxa"/>
-            <w:vAlign w:val="center"/>
-          </w:tcPr>
-          <w:p>
-            <w:pPr>
-              <w:jc w:val="center"/>
-              <w:rPr>
-                <w:rFonts w:asciiTheme="minorHAnsi" w:hAnsiTheme="minorHAnsi" w:cstheme="minorHAnsi"/>
-              </w:rPr>
-            </w:pPr>
-          </w:p>
-        </w:tc>
-        <w:tc>
-          <w:tcPr>
-            <w:tcW w:w="1396" w:type="dxa"/>
-            <w:vAlign w:val="center"/>
-          </w:tcPr>
-          <w:p>
-            <w:pPr>
-              <w:jc w:val="center"/>
-              <w:rPr>
-                <w:rFonts w:asciiTheme="minorHAnsi" w:hAnsiTheme="minorHAnsi" w:cstheme="minorHAnsi"/>
-              </w:rPr>
-            </w:pPr>
-          </w:p>
-        </w:tc>
-      </w:tr>
-      <w:tr>
-        <w:trPr>
-          <w:trHeight w:val="340"/>
-        </w:trPr>
-        <w:tc>
-          <w:tcPr>
-            <w:tcW w:w="535" w:type="dxa"/>
-            <w:shd w:val="clear" w:color="auto" w:fill="F2F2F2" w:themeFill="background1" w:themeFillShade="F2"/>
-            <w:vAlign w:val="center"/>
-          </w:tcPr>
-          <w:p>
+          <w:p ns2:paraId="3327FCF0" ns2:textId="77777777">
             <w:pPr>
               <w:jc w:val="center"/>
               <w:rPr>
@@ -2826,7 +2259,7 @@
             <w:shd w:val="clear" w:color="auto" w:fill="F2F2F2" w:themeFill="background1" w:themeFillShade="F2"/>
             <w:vAlign w:val="center"/>
           </w:tcPr>
-          <w:p>
+          <w:p ns2:paraId="201F5FF3" ns2:textId="77777777">
             <w:pPr>
               <w:jc w:val="center"/>
               <w:rPr>
@@ -2846,7 +2279,7 @@
             <w:tcW w:w="928" w:type="dxa"/>
             <w:vAlign w:val="center"/>
           </w:tcPr>
-          <w:p>
+          <w:p ns2:paraId="6EB0C22B" ns2:textId="77777777">
             <w:pPr>
               <w:jc w:val="center"/>
               <w:rPr>
@@ -2860,7 +2293,7 @@
             <w:tcW w:w="1623" w:type="dxa"/>
             <w:vAlign w:val="center"/>
           </w:tcPr>
-          <w:p>
+          <w:p ns2:paraId="0E15E41C" ns2:textId="77777777">
             <w:pPr>
               <w:jc w:val="center"/>
               <w:rPr>
@@ -2874,7 +2307,7 @@
             <w:tcW w:w="1312" w:type="dxa"/>
             <w:vAlign w:val="center"/>
           </w:tcPr>
-          <w:p>
+          <w:p ns2:paraId="78DCBCA4" ns2:textId="0D21AEA9">
             <w:pPr>
               <w:jc w:val="center"/>
               <w:rPr>
@@ -2911,7 +2344,7 @@
             <w:tcW w:w="1396" w:type="dxa"/>
             <w:vAlign w:val="center"/>
           </w:tcPr>
-          <w:p>
+          <w:p ns2:paraId="473DE1CE" ns2:textId="77777777">
             <w:pPr>
               <w:jc w:val="center"/>
               <w:rPr>
@@ -2922,7 +2355,7 @@
         </w:tc>
       </w:tr>
     </w:tbl>
-    <w:p>
+    <w:p ns2:paraId="734AD3B1" ns2:textId="77777777">
       <w:pPr>
         <w:rPr>
           <w:rFonts w:asciiTheme="minorHAnsi" w:hAnsiTheme="minorHAnsi" w:cstheme="minorHAnsi"/>
@@ -2931,7 +2364,7 @@
         </w:rPr>
       </w:pPr>
     </w:p>
-    <w:p>
+    <w:p ns2:paraId="18A823C4" ns2:textId="5B1B754C">
       <w:pPr>
         <w:spacing w:line="360" w:lineRule="auto"/>
         <w:rPr>
@@ -2949,7 +2382,7 @@
         <w:t xml:space="preserve">Osoba odpowiedzialna za rozliczenie kosztów i przedłożenie rachunków </w:t>
       </w:r>
     </w:p>
-    <w:p>
+    <w:p ns2:paraId="0570D06D" ns2:textId="728F9A05">
       <w:pPr>
         <w:tabs>
           <w:tab w:val="left" w:leader="dot" w:pos="9639"/>
@@ -2995,7 +2428,7 @@
         <w:tab/>
       </w:r>
     </w:p>
-    <w:p>
+    <w:p ns2:paraId="53F89E3E" ns2:textId="2A0F7671">
       <w:pPr>
         <w:pStyle w:val="Akapitzlist"/>
         <w:tabs>
@@ -3077,7 +2510,7 @@
         <w:tab/>
       </w:r>
     </w:p>
-    <w:p>
+    <w:p ns2:paraId="03DB96A8" ns2:textId="77777777">
       <w:pPr>
         <w:spacing w:line="360" w:lineRule="auto"/>
         <w:rPr>
@@ -3095,7 +2528,7 @@
         <w:t>Informacje dotyczące przelewu:</w:t>
       </w:r>
     </w:p>
-    <w:p>
+    <w:p ns2:paraId="1A2F4E40" ns2:textId="687B3E8C">
       <w:pPr>
         <w:tabs>
           <w:tab w:val="left" w:leader="dot" w:pos="6096"/>
@@ -3133,7 +2566,7 @@
         <w:tab/>
       </w:r>
     </w:p>
-    <w:p>
+    <w:p ns2:paraId="23D9AEF7" ns2:textId="77777777">
       <w:pPr>
         <w:tabs>
           <w:tab w:val="left" w:leader="dot" w:pos="9639"/>
@@ -3156,7 +2589,7 @@
         <w:tab/>
       </w:r>
     </w:p>
-    <w:p>
+    <w:p ns2:paraId="7119F8AB" ns2:textId="12A51501">
       <w:pPr>
         <w:tabs>
           <w:tab w:val="left" w:leader="dot" w:pos="9639"/>
@@ -3179,7 +2612,7 @@
         <w:tab/>
       </w:r>
     </w:p>
-    <w:p>
+    <w:p ns2:paraId="0C65A824" ns2:textId="55B0535F">
       <w:pPr>
         <w:tabs>
           <w:tab w:val="left" w:pos="9639"/>
@@ -3208,7 +2641,7 @@
         <w:t>………………………………………………………………………………………………………….</w:t>
       </w:r>
     </w:p>
-    <w:p>
+    <w:p ns2:paraId="32F035D6" ns2:textId="35059872">
       <w:pPr>
         <w:tabs>
           <w:tab w:val="left" w:pos="284"/>
@@ -3253,7 +2686,7 @@
         <w:tab/>
       </w:r>
     </w:p>
-    <w:p>
+    <w:p ns2:paraId="111DF983" ns2:textId="52605BD8">
       <w:pPr>
         <w:tabs>
           <w:tab w:val="left" w:pos="9639"/>
@@ -3296,7 +2729,7 @@
         <w:t>.</w:t>
       </w:r>
     </w:p>
-    <w:p>
+    <w:p ns2:paraId="444E1487" ns2:textId="3B268519">
       <w:pPr>
         <w:tabs>
           <w:tab w:val="left" w:pos="9639"/>
@@ -3313,7 +2746,7 @@
         <w:t>Nazwa banku</w:t>
       </w:r>
     </w:p>
-    <w:p>
+    <w:p ns2:paraId="02766B52" ns2:textId="77777777">
       <w:pPr>
         <w:tabs>
           <w:tab w:val="left" w:leader="dot" w:pos="9639"/>
@@ -3330,7 +2763,7 @@
         <w:tab/>
       </w:r>
     </w:p>
-    <w:p>
+    <w:p ns2:paraId="13FFC7F6" ns2:textId="4FCCE93F">
       <w:pPr>
         <w:spacing w:line="360" w:lineRule="auto"/>
         <w:rPr>
@@ -3386,7 +2819,7 @@
         <w:gridCol w:w="350"/>
         <w:gridCol w:w="350"/>
       </w:tblGrid>
-      <w:tr>
+      <w:tr ns2:paraId="0314E985" ns2:textId="77777777">
         <w:trPr>
           <w:jc w:val="center"/>
         </w:trPr>
@@ -3394,7 +2827,7 @@
           <w:tcPr>
             <w:tcW w:w="349" w:type="dxa"/>
           </w:tcPr>
-          <w:p>
+          <w:p ns2:paraId="56A6F16C" ns2:textId="77777777">
             <w:pPr>
               <w:spacing w:line="360" w:lineRule="auto"/>
               <w:rPr>
@@ -3407,7 +2840,7 @@
           <w:tcPr>
             <w:tcW w:w="349" w:type="dxa"/>
           </w:tcPr>
-          <w:p>
+          <w:p ns2:paraId="5D88B0E5" ns2:textId="77777777">
             <w:pPr>
               <w:spacing w:line="360" w:lineRule="auto"/>
               <w:rPr>
@@ -3421,7 +2854,7 @@
             <w:tcW w:w="349" w:type="dxa"/>
             <w:shd w:val="clear" w:color="auto" w:fill="BFBFBF"/>
           </w:tcPr>
-          <w:p>
+          <w:p ns2:paraId="5FF73A46" ns2:textId="77777777">
             <w:pPr>
               <w:spacing w:line="360" w:lineRule="auto"/>
               <w:rPr>
@@ -3435,7 +2868,7 @@
             <w:tcW w:w="349" w:type="dxa"/>
             <w:shd w:val="clear" w:color="auto" w:fill="BFBFBF"/>
           </w:tcPr>
-          <w:p>
+          <w:p ns2:paraId="2A837DA7" ns2:textId="77777777">
             <w:pPr>
               <w:spacing w:line="360" w:lineRule="auto"/>
               <w:rPr>
@@ -3449,7 +2882,7 @@
             <w:tcW w:w="349" w:type="dxa"/>
             <w:shd w:val="clear" w:color="auto" w:fill="BFBFBF"/>
           </w:tcPr>
-          <w:p>
+          <w:p ns2:paraId="11782A91" ns2:textId="77777777">
             <w:pPr>
               <w:spacing w:line="360" w:lineRule="auto"/>
               <w:rPr>
@@ -3463,7 +2896,7 @@
             <w:tcW w:w="349" w:type="dxa"/>
             <w:shd w:val="clear" w:color="auto" w:fill="BFBFBF"/>
           </w:tcPr>
-          <w:p>
+          <w:p ns2:paraId="4A05A74F" ns2:textId="77777777">
             <w:pPr>
               <w:spacing w:line="360" w:lineRule="auto"/>
               <w:rPr>
@@ -3476,7 +2909,7 @@
           <w:tcPr>
             <w:tcW w:w="349" w:type="dxa"/>
           </w:tcPr>
-          <w:p>
+          <w:p ns2:paraId="55F06919" ns2:textId="77777777">
             <w:pPr>
               <w:spacing w:line="360" w:lineRule="auto"/>
               <w:rPr>
@@ -3489,7 +2922,7 @@
           <w:tcPr>
             <w:tcW w:w="349" w:type="dxa"/>
           </w:tcPr>
-          <w:p>
+          <w:p ns2:paraId="02FCD767" ns2:textId="77777777">
             <w:pPr>
               <w:spacing w:line="360" w:lineRule="auto"/>
               <w:rPr>
@@ -3502,7 +2935,7 @@
           <w:tcPr>
             <w:tcW w:w="349" w:type="dxa"/>
           </w:tcPr>
-          <w:p>
+          <w:p ns2:paraId="38E02C70" ns2:textId="77777777">
             <w:pPr>
               <w:spacing w:line="360" w:lineRule="auto"/>
               <w:rPr>
@@ -3515,7 +2948,7 @@
           <w:tcPr>
             <w:tcW w:w="349" w:type="dxa"/>
           </w:tcPr>
-          <w:p>
+          <w:p ns2:paraId="0B158A01" ns2:textId="77777777">
             <w:pPr>
               <w:spacing w:line="360" w:lineRule="auto"/>
               <w:rPr>
@@ -3529,7 +2962,7 @@
             <w:tcW w:w="349" w:type="dxa"/>
             <w:shd w:val="clear" w:color="auto" w:fill="BFBFBF"/>
           </w:tcPr>
-          <w:p>
+          <w:p ns2:paraId="545BED27" ns2:textId="77777777">
             <w:pPr>
               <w:spacing w:line="360" w:lineRule="auto"/>
               <w:rPr>
@@ -3543,7 +2976,7 @@
             <w:tcW w:w="349" w:type="dxa"/>
             <w:shd w:val="clear" w:color="auto" w:fill="BFBFBF"/>
           </w:tcPr>
-          <w:p>
+          <w:p ns2:paraId="65A5D220" ns2:textId="77777777">
             <w:pPr>
               <w:spacing w:line="360" w:lineRule="auto"/>
               <w:rPr>
@@ -3557,7 +2990,7 @@
             <w:tcW w:w="350" w:type="dxa"/>
             <w:shd w:val="clear" w:color="auto" w:fill="BFBFBF"/>
           </w:tcPr>
-          <w:p>
+          <w:p ns2:paraId="257AF11D" ns2:textId="77777777">
             <w:pPr>
               <w:spacing w:line="360" w:lineRule="auto"/>
               <w:rPr>
@@ -3571,7 +3004,7 @@
             <w:tcW w:w="350" w:type="dxa"/>
             <w:shd w:val="clear" w:color="auto" w:fill="BFBFBF"/>
           </w:tcPr>
-          <w:p>
+          <w:p ns2:paraId="7880B70E" ns2:textId="77777777">
             <w:pPr>
               <w:spacing w:line="360" w:lineRule="auto"/>
               <w:rPr>
@@ -3584,7 +3017,7 @@
           <w:tcPr>
             <w:tcW w:w="350" w:type="dxa"/>
           </w:tcPr>
-          <w:p>
+          <w:p ns2:paraId="7CFB85E6" ns2:textId="77777777">
             <w:pPr>
               <w:spacing w:line="360" w:lineRule="auto"/>
               <w:rPr>
@@ -3597,7 +3030,7 @@
           <w:tcPr>
             <w:tcW w:w="350" w:type="dxa"/>
           </w:tcPr>
-          <w:p>
+          <w:p ns2:paraId="584CC576" ns2:textId="77777777">
             <w:pPr>
               <w:spacing w:line="360" w:lineRule="auto"/>
               <w:rPr>
@@ -3610,7 +3043,7 @@
           <w:tcPr>
             <w:tcW w:w="350" w:type="dxa"/>
           </w:tcPr>
-          <w:p>
+          <w:p ns2:paraId="144011EB" ns2:textId="77777777">
             <w:pPr>
               <w:spacing w:line="360" w:lineRule="auto"/>
               <w:rPr>
@@ -3623,7 +3056,7 @@
           <w:tcPr>
             <w:tcW w:w="350" w:type="dxa"/>
           </w:tcPr>
-          <w:p>
+          <w:p ns2:paraId="78FC13DF" ns2:textId="77777777">
             <w:pPr>
               <w:spacing w:line="360" w:lineRule="auto"/>
               <w:rPr>
@@ -3637,7 +3070,7 @@
             <w:tcW w:w="350" w:type="dxa"/>
             <w:shd w:val="clear" w:color="auto" w:fill="BFBFBF"/>
           </w:tcPr>
-          <w:p>
+          <w:p ns2:paraId="7993585B" ns2:textId="77777777">
             <w:pPr>
               <w:spacing w:line="360" w:lineRule="auto"/>
               <w:rPr>
@@ -3651,7 +3084,7 @@
             <w:tcW w:w="350" w:type="dxa"/>
             <w:shd w:val="clear" w:color="auto" w:fill="BFBFBF"/>
           </w:tcPr>
-          <w:p>
+          <w:p ns2:paraId="24B18F20" ns2:textId="77777777">
             <w:pPr>
               <w:spacing w:line="360" w:lineRule="auto"/>
               <w:rPr>
@@ -3665,7 +3098,7 @@
             <w:tcW w:w="350" w:type="dxa"/>
             <w:shd w:val="clear" w:color="auto" w:fill="BFBFBF"/>
           </w:tcPr>
-          <w:p>
+          <w:p ns2:paraId="4ACC8009" ns2:textId="77777777">
             <w:pPr>
               <w:spacing w:line="360" w:lineRule="auto"/>
               <w:rPr>
@@ -3679,7 +3112,7 @@
             <w:tcW w:w="350" w:type="dxa"/>
             <w:shd w:val="clear" w:color="auto" w:fill="BFBFBF"/>
           </w:tcPr>
-          <w:p>
+          <w:p ns2:paraId="2258C911" ns2:textId="77777777">
             <w:pPr>
               <w:spacing w:line="360" w:lineRule="auto"/>
               <w:rPr>
@@ -3692,7 +3125,7 @@
           <w:tcPr>
             <w:tcW w:w="350" w:type="dxa"/>
           </w:tcPr>
-          <w:p>
+          <w:p ns2:paraId="432644F4" ns2:textId="77777777">
             <w:pPr>
               <w:spacing w:line="360" w:lineRule="auto"/>
               <w:rPr>
@@ -3705,7 +3138,7 @@
           <w:tcPr>
             <w:tcW w:w="350" w:type="dxa"/>
           </w:tcPr>
-          <w:p>
+          <w:p ns2:paraId="2E300BD3" ns2:textId="77777777">
             <w:pPr>
               <w:spacing w:line="360" w:lineRule="auto"/>
               <w:rPr>
@@ -3718,7 +3151,7 @@
           <w:tcPr>
             <w:tcW w:w="350" w:type="dxa"/>
           </w:tcPr>
-          <w:p>
+          <w:p ns2:paraId="04426690" ns2:textId="77777777">
             <w:pPr>
               <w:spacing w:line="360" w:lineRule="auto"/>
               <w:rPr>
@@ -3731,7 +3164,7 @@
           <w:tcPr>
             <w:tcW w:w="350" w:type="dxa"/>
           </w:tcPr>
-          <w:p>
+          <w:p ns2:paraId="02654BAD" ns2:textId="77777777">
             <w:pPr>
               <w:spacing w:line="360" w:lineRule="auto"/>
               <w:rPr>
@@ -3742,7 +3175,7 @@
         </w:tc>
       </w:tr>
     </w:tbl>
-    <w:p>
+    <w:p ns2:paraId="544F333D" ns2:textId="77777777">
       <w:pPr>
         <w:spacing w:line="360" w:lineRule="auto"/>
         <w:rPr>
@@ -3750,7 +3183,7 @@
         </w:rPr>
       </w:pPr>
     </w:p>
-    <w:p>
+    <w:p ns2:paraId="7D6D842B" ns2:textId="77777777">
       <w:pPr>
         <w:tabs>
           <w:tab w:val="left" w:leader="dot" w:pos="9639"/>
@@ -3773,7 +3206,7 @@
         <w:tab/>
       </w:r>
     </w:p>
-    <w:p>
+    <w:p ns2:paraId="57124972" ns2:textId="1AD3C99A">
       <w:pPr>
         <w:tabs>
           <w:tab w:val="left" w:pos="1134"/>
@@ -3824,7 +3257,7 @@
         <w:tab/>
       </w:r>
     </w:p>
-    <w:p>
+    <w:p ns2:paraId="73988FE6" ns2:textId="72CE960A">
       <w:pPr>
         <w:tabs>
           <w:tab w:val="left" w:pos="993"/>
@@ -3961,7 +3394,7 @@
         <w:t>)</w:t>
       </w:r>
     </w:p>
-    <w:p>
+    <w:p ns2:paraId="518FC38F" ns2:textId="77777777">
       <w:pPr>
         <w:spacing w:line="360" w:lineRule="auto"/>
         <w:rPr>
@@ -3970,7 +3403,7 @@
           <w:szCs w:val="18"/>
         </w:rPr>
         <w:sectPr>
-          <w:footerReference w:type="default" r:id="rId8"/>
+          <w:footerReference w:type="default" ns3:id="rId8"/>
           <w:pgSz w:w="11907" w:h="16840"/>
           <w:pgMar w:top="454" w:right="851" w:bottom="454" w:left="1134" w:header="709" w:footer="709" w:gutter="0"/>
           <w:pgNumType w:start="1" w:chapStyle="1"/>
@@ -3979,7 +3412,7 @@
         </w:sectPr>
       </w:pPr>
     </w:p>
-    <w:p>
+    <w:p ns2:paraId="3AC011DC" ns2:textId="77777777">
       <w:pPr>
         <w:pStyle w:val="Nagwek1"/>
         <w:pageBreakBefore/>
@@ -3999,7 +3432,7 @@
         <w:t xml:space="preserve">Lista uczestników </w:t>
       </w:r>
     </w:p>
-    <w:p>
+    <w:p ns2:paraId="64D04944" ns2:textId="412B9E86">
       <w:pPr>
         <w:tabs>
           <w:tab w:val="left" w:pos="3686"/>
@@ -4126,7 +3559,7 @@
         <w:t>}</w:t>
       </w:r>
     </w:p>
-    <w:p>
+    <w:p ns2:paraId="2597B502" ns2:textId="7ADF6096">
       <w:pPr>
         <w:ind w:left="2832" w:firstLine="708"/>
         <w:rPr>
@@ -4176,7 +3609,7 @@
         <w:t>(miejscowość)</w:t>
       </w:r>
     </w:p>
-    <w:p>
+    <w:p ns2:paraId="7009B157" ns2:textId="28F4112B">
       <w:pPr>
         <w:spacing w:before="240" w:line="276" w:lineRule="auto"/>
         <w:rPr>
@@ -4214,7 +3647,7 @@
         <w:t>…………………………………...</w:t>
       </w:r>
     </w:p>
-    <w:p>
+    <w:p ns2:paraId="3EE546B3" ns2:textId="77777777">
       <w:pPr>
         <w:jc w:val="center"/>
         <w:rPr>
@@ -4228,7 +3661,7 @@
         <w:t>(nazwa uczelnianej organizacji)</w:t>
       </w:r>
     </w:p>
-    <w:p>
+    <w:p ns2:paraId="3B4A99E9" ns2:textId="77777777">
       <w:pPr>
         <w:rPr>
           <w:rFonts w:asciiTheme="minorHAnsi" w:hAnsiTheme="minorHAnsi" w:cstheme="minorHAnsi"/>
@@ -4257,7 +3690,7 @@
         <w:gridCol w:w="744"/>
         <w:gridCol w:w="2582"/>
       </w:tblGrid>
-      <w:tr>
+      <w:tr ns2:paraId="0801FC45" ns2:textId="77777777">
         <w:trPr>
           <w:tblHeader/>
           <w:jc w:val="center"/>
@@ -4271,7 +3704,7 @@
             <w:shd w:val="clear" w:color="auto" w:fill="F2F2F2" w:themeFill="background1" w:themeFillShade="F2"/>
             <w:vAlign w:val="center"/>
           </w:tcPr>
-          <w:p>
+          <w:p ns2:paraId="37FF4A33" ns2:textId="77777777">
             <w:pPr>
               <w:jc w:val="center"/>
               <w:rPr>
@@ -4292,7 +3725,7 @@
             <w:shd w:val="clear" w:color="auto" w:fill="F2F2F2" w:themeFill="background1" w:themeFillShade="F2"/>
             <w:vAlign w:val="center"/>
           </w:tcPr>
-          <w:p>
+          <w:p ns2:paraId="57CE561A" ns2:textId="77777777">
             <w:pPr>
               <w:jc w:val="center"/>
               <w:rPr>
@@ -4313,7 +3746,7 @@
             <w:shd w:val="clear" w:color="auto" w:fill="F2F2F2" w:themeFill="background1" w:themeFillShade="F2"/>
             <w:vAlign w:val="center"/>
           </w:tcPr>
-          <w:p>
+          <w:p ns2:paraId="21C9F98A" ns2:textId="77777777">
             <w:pPr>
               <w:jc w:val="center"/>
               <w:rPr>
@@ -4334,7 +3767,7 @@
             <w:shd w:val="clear" w:color="auto" w:fill="F2F2F2" w:themeFill="background1" w:themeFillShade="F2"/>
             <w:vAlign w:val="center"/>
           </w:tcPr>
-          <w:p>
+          <w:p ns2:paraId="5C76F1A8" ns2:textId="77777777">
             <w:pPr>
               <w:jc w:val="center"/>
               <w:rPr>
@@ -4355,7 +3788,7 @@
             <w:shd w:val="clear" w:color="auto" w:fill="F2F2F2" w:themeFill="background1" w:themeFillShade="F2"/>
             <w:vAlign w:val="center"/>
           </w:tcPr>
-          <w:p>
+          <w:p ns2:paraId="5A21A1A8" ns2:textId="77777777">
             <w:pPr>
               <w:jc w:val="center"/>
               <w:rPr>
@@ -4376,7 +3809,7 @@
             <w:shd w:val="clear" w:color="auto" w:fill="F2F2F2" w:themeFill="background1" w:themeFillShade="F2"/>
             <w:vAlign w:val="center"/>
           </w:tcPr>
-          <w:p>
+          <w:p ns2:paraId="57438BE3" ns2:textId="77777777">
             <w:pPr>
               <w:jc w:val="center"/>
               <w:rPr>
@@ -4390,7 +3823,7 @@
               <w:t xml:space="preserve">Dane kontaktowe </w:t>
             </w:r>
           </w:p>
-          <w:p>
+          <w:p ns2:paraId="555A65D8" ns2:textId="77777777">
             <w:pPr>
               <w:jc w:val="center"/>
               <w:rPr>
@@ -4406,7 +3839,7 @@
           </w:p>
         </w:tc>
       </w:tr>
-      <w:tr>
+      <w:tr ns2:paraId="1615976F" ns2:textId="77777777">
         <w:trPr>
           <w:trHeight w:val="454"/>
           <w:jc w:val="center"/>
@@ -4417,7 +3850,7 @@
             <w:shd w:val="clear" w:color="auto" w:fill="F2F2F2" w:themeFill="background1" w:themeFillShade="F2"/>
             <w:vAlign w:val="center"/>
           </w:tcPr>
-          <w:p>
+          <w:p ns2:paraId="4F378CA7" ns2:textId="77777777">
             <w:pPr>
               <w:spacing w:line="360" w:lineRule="auto"/>
               <w:jc w:val="center"/>
@@ -4438,7 +3871,7 @@
             <w:tcW w:w="2111" w:type="dxa"/>
             <w:vAlign w:val="center"/>
           </w:tcPr>
-          <w:p>
+          <w:p ns2:paraId="211BB53E" ns2:textId="77777777">
             <w:pPr>
               <w:spacing w:line="360" w:lineRule="auto"/>
               <w:jc w:val="center"/>
@@ -4453,7 +3886,7 @@
             <w:tcW w:w="2249" w:type="dxa"/>
             <w:vAlign w:val="center"/>
           </w:tcPr>
-          <w:p>
+          <w:p ns2:paraId="3F04C572" ns2:textId="77777777">
             <w:pPr>
               <w:spacing w:line="360" w:lineRule="auto"/>
               <w:jc w:val="center"/>
@@ -4468,7 +3901,7 @@
             <w:tcW w:w="1691" w:type="dxa"/>
             <w:vAlign w:val="center"/>
           </w:tcPr>
-          <w:p>
+          <w:p ns2:paraId="3517698D" ns2:textId="77777777">
             <w:pPr>
               <w:spacing w:line="360" w:lineRule="auto"/>
               <w:jc w:val="center"/>
@@ -4483,7 +3916,7 @@
             <w:tcW w:w="744" w:type="dxa"/>
             <w:vAlign w:val="center"/>
           </w:tcPr>
-          <w:p>
+          <w:p ns2:paraId="5E391678" ns2:textId="77777777">
             <w:pPr>
               <w:spacing w:line="360" w:lineRule="auto"/>
               <w:jc w:val="center"/>
@@ -4498,7 +3931,7 @@
             <w:tcW w:w="2582" w:type="dxa"/>
             <w:vAlign w:val="center"/>
           </w:tcPr>
-          <w:p>
+          <w:p ns2:paraId="4F1FE80A" ns2:textId="77777777">
             <w:pPr>
               <w:spacing w:line="360" w:lineRule="auto"/>
               <w:jc w:val="center"/>
@@ -4509,7 +3942,7 @@
           </w:p>
         </w:tc>
       </w:tr>
-      <w:tr>
+      <w:tr ns2:paraId="29D63FA3" ns2:textId="77777777">
         <w:trPr>
           <w:trHeight w:val="454"/>
           <w:jc w:val="center"/>
@@ -4520,7 +3953,7 @@
             <w:shd w:val="clear" w:color="auto" w:fill="F2F2F2" w:themeFill="background1" w:themeFillShade="F2"/>
             <w:vAlign w:val="center"/>
           </w:tcPr>
-          <w:p>
+          <w:p ns2:paraId="555F41F5" ns2:textId="77777777">
             <w:pPr>
               <w:spacing w:line="360" w:lineRule="auto"/>
               <w:jc w:val="center"/>
@@ -4541,7 +3974,7 @@
             <w:tcW w:w="2111" w:type="dxa"/>
             <w:vAlign w:val="center"/>
           </w:tcPr>
-          <w:p>
+          <w:p ns2:paraId="42723C87" ns2:textId="77777777">
             <w:pPr>
               <w:spacing w:line="360" w:lineRule="auto"/>
               <w:jc w:val="center"/>
@@ -4556,7 +3989,7 @@
             <w:tcW w:w="2249" w:type="dxa"/>
             <w:vAlign w:val="center"/>
           </w:tcPr>
-          <w:p>
+          <w:p ns2:paraId="3388EFCB" ns2:textId="77777777">
             <w:pPr>
               <w:spacing w:line="360" w:lineRule="auto"/>
               <w:jc w:val="center"/>
@@ -4571,7 +4004,7 @@
             <w:tcW w:w="1691" w:type="dxa"/>
             <w:vAlign w:val="center"/>
           </w:tcPr>
-          <w:p>
+          <w:p ns2:paraId="2764160A" ns2:textId="77777777">
             <w:pPr>
               <w:spacing w:line="360" w:lineRule="auto"/>
               <w:jc w:val="center"/>
@@ -4586,7 +4019,7 @@
             <w:tcW w:w="744" w:type="dxa"/>
             <w:vAlign w:val="center"/>
           </w:tcPr>
-          <w:p>
+          <w:p ns2:paraId="45AE4890" ns2:textId="77777777">
             <w:pPr>
               <w:spacing w:line="360" w:lineRule="auto"/>
               <w:jc w:val="center"/>
@@ -4601,7 +4034,7 @@
             <w:tcW w:w="2582" w:type="dxa"/>
             <w:vAlign w:val="center"/>
           </w:tcPr>
-          <w:p>
+          <w:p ns2:paraId="4A22885D" ns2:textId="77777777">
             <w:pPr>
               <w:spacing w:line="360" w:lineRule="auto"/>
               <w:jc w:val="center"/>
@@ -4612,7 +4045,7 @@
           </w:p>
         </w:tc>
       </w:tr>
-      <w:tr>
+      <w:tr ns2:paraId="2645F027" ns2:textId="77777777">
         <w:trPr>
           <w:trHeight w:val="454"/>
           <w:jc w:val="center"/>
@@ -4623,7 +4056,7 @@
             <w:shd w:val="clear" w:color="auto" w:fill="F2F2F2" w:themeFill="background1" w:themeFillShade="F2"/>
             <w:vAlign w:val="center"/>
           </w:tcPr>
-          <w:p>
+          <w:p ns2:paraId="1B54209E" ns2:textId="77777777">
             <w:pPr>
               <w:spacing w:line="360" w:lineRule="auto"/>
               <w:jc w:val="center"/>
@@ -4644,7 +4077,7 @@
             <w:tcW w:w="2111" w:type="dxa"/>
             <w:vAlign w:val="center"/>
           </w:tcPr>
-          <w:p>
+          <w:p ns2:paraId="0573FD0F" ns2:textId="77777777">
             <w:pPr>
               <w:spacing w:line="360" w:lineRule="auto"/>
               <w:jc w:val="center"/>
@@ -4659,7 +4092,7 @@
             <w:tcW w:w="2249" w:type="dxa"/>
             <w:vAlign w:val="center"/>
           </w:tcPr>
-          <w:p>
+          <w:p ns2:paraId="4DBFC9A4" ns2:textId="77777777">
             <w:pPr>
               <w:spacing w:line="360" w:lineRule="auto"/>
               <w:jc w:val="center"/>
@@ -4674,7 +4107,7 @@
             <w:tcW w:w="1691" w:type="dxa"/>
             <w:vAlign w:val="center"/>
           </w:tcPr>
-          <w:p>
+          <w:p ns2:paraId="51A78453" ns2:textId="77777777">
             <w:pPr>
               <w:spacing w:line="360" w:lineRule="auto"/>
               <w:jc w:val="center"/>
@@ -4689,7 +4122,7 @@
             <w:tcW w:w="744" w:type="dxa"/>
             <w:vAlign w:val="center"/>
           </w:tcPr>
-          <w:p>
+          <w:p ns2:paraId="228C45A3" ns2:textId="77777777">
             <w:pPr>
               <w:spacing w:line="360" w:lineRule="auto"/>
               <w:jc w:val="center"/>
@@ -4704,7 +4137,7 @@
             <w:tcW w:w="2582" w:type="dxa"/>
             <w:vAlign w:val="center"/>
           </w:tcPr>
-          <w:p>
+          <w:p ns2:paraId="7A583DC0" ns2:textId="77777777">
             <w:pPr>
               <w:spacing w:line="360" w:lineRule="auto"/>
               <w:jc w:val="center"/>
@@ -4715,7 +4148,7 @@
           </w:p>
         </w:tc>
       </w:tr>
-      <w:tr>
+      <w:tr ns2:paraId="4FC5F28C" ns2:textId="77777777">
         <w:trPr>
           <w:trHeight w:val="454"/>
           <w:jc w:val="center"/>
@@ -4726,7 +4159,7 @@
             <w:shd w:val="clear" w:color="auto" w:fill="F2F2F2" w:themeFill="background1" w:themeFillShade="F2"/>
             <w:vAlign w:val="center"/>
           </w:tcPr>
-          <w:p>
+          <w:p ns2:paraId="641AD651" ns2:textId="77777777">
             <w:pPr>
               <w:spacing w:line="360" w:lineRule="auto"/>
               <w:jc w:val="center"/>
@@ -4747,7 +4180,7 @@
             <w:tcW w:w="2111" w:type="dxa"/>
             <w:vAlign w:val="center"/>
           </w:tcPr>
-          <w:p>
+          <w:p ns2:paraId="749CCC92" ns2:textId="77777777">
             <w:pPr>
               <w:spacing w:line="360" w:lineRule="auto"/>
               <w:jc w:val="center"/>
@@ -4762,7 +4195,7 @@
             <w:tcW w:w="2249" w:type="dxa"/>
             <w:vAlign w:val="center"/>
           </w:tcPr>
-          <w:p>
+          <w:p ns2:paraId="3E60F380" ns2:textId="77777777">
             <w:pPr>
               <w:spacing w:line="360" w:lineRule="auto"/>
               <w:jc w:val="center"/>
@@ -4777,7 +4210,7 @@
             <w:tcW w:w="1691" w:type="dxa"/>
             <w:vAlign w:val="center"/>
           </w:tcPr>
-          <w:p>
+          <w:p ns2:paraId="286A5616" ns2:textId="77777777">
             <w:pPr>
               <w:spacing w:line="360" w:lineRule="auto"/>
               <w:jc w:val="center"/>
@@ -4792,7 +4225,7 @@
             <w:tcW w:w="744" w:type="dxa"/>
             <w:vAlign w:val="center"/>
           </w:tcPr>
-          <w:p>
+          <w:p ns2:paraId="127542A4" ns2:textId="77777777">
             <w:pPr>
               <w:spacing w:line="360" w:lineRule="auto"/>
               <w:jc w:val="center"/>
@@ -4807,7 +4240,7 @@
             <w:tcW w:w="2582" w:type="dxa"/>
             <w:vAlign w:val="center"/>
           </w:tcPr>
-          <w:p>
+          <w:p ns2:paraId="378A4D58" ns2:textId="77777777">
             <w:pPr>
               <w:spacing w:line="360" w:lineRule="auto"/>
               <w:jc w:val="center"/>
@@ -4818,7 +4251,7 @@
           </w:p>
         </w:tc>
       </w:tr>
-      <w:tr>
+      <w:tr ns2:paraId="6E4594F1" ns2:textId="77777777">
         <w:trPr>
           <w:trHeight w:val="454"/>
           <w:jc w:val="center"/>
@@ -4829,7 +4262,7 @@
             <w:shd w:val="clear" w:color="auto" w:fill="F2F2F2" w:themeFill="background1" w:themeFillShade="F2"/>
             <w:vAlign w:val="center"/>
           </w:tcPr>
-          <w:p>
+          <w:p ns2:paraId="77F6CCEF" ns2:textId="77777777">
             <w:pPr>
               <w:spacing w:line="360" w:lineRule="auto"/>
               <w:jc w:val="center"/>
@@ -4850,7 +4283,7 @@
             <w:tcW w:w="2111" w:type="dxa"/>
             <w:vAlign w:val="center"/>
           </w:tcPr>
-          <w:p>
+          <w:p ns2:paraId="5220D220" ns2:textId="77777777">
             <w:pPr>
               <w:spacing w:line="360" w:lineRule="auto"/>
               <w:jc w:val="center"/>
@@ -4865,7 +4298,7 @@
             <w:tcW w:w="2249" w:type="dxa"/>
             <w:vAlign w:val="center"/>
           </w:tcPr>
-          <w:p>
+          <w:p ns2:paraId="502A05A4" ns2:textId="77777777">
             <w:pPr>
               <w:spacing w:line="360" w:lineRule="auto"/>
               <w:jc w:val="center"/>
@@ -4880,7 +4313,7 @@
             <w:tcW w:w="1691" w:type="dxa"/>
             <w:vAlign w:val="center"/>
           </w:tcPr>
-          <w:p>
+          <w:p ns2:paraId="7727539E" ns2:textId="77777777">
             <w:pPr>
               <w:spacing w:line="360" w:lineRule="auto"/>
               <w:jc w:val="center"/>
@@ -4895,7 +4328,7 @@
             <w:tcW w:w="744" w:type="dxa"/>
             <w:vAlign w:val="center"/>
           </w:tcPr>
-          <w:p>
+          <w:p ns2:paraId="3ABFDBF2" ns2:textId="77777777">
             <w:pPr>
               <w:spacing w:line="360" w:lineRule="auto"/>
               <w:jc w:val="center"/>
@@ -4910,7 +4343,7 @@
             <w:tcW w:w="2582" w:type="dxa"/>
             <w:vAlign w:val="center"/>
           </w:tcPr>
-          <w:p>
+          <w:p ns2:paraId="6D659D04" ns2:textId="77777777">
             <w:pPr>
               <w:spacing w:line="360" w:lineRule="auto"/>
               <w:jc w:val="center"/>
@@ -4922,7 +4355,7 @@
         </w:tc>
       </w:tr>
     </w:tbl>
-    <w:p>
+    <w:p ns2:paraId="7E6FD05E" ns2:textId="77777777">
       <w:pPr>
         <w:pStyle w:val="gwpa5e667c8gwp3cb86075msonormal"/>
         <w:shd w:val="clear" w:color="auto" w:fill="FFFFFF"/>
@@ -4999,7 +4432,7 @@
         <w:t>3. Pani/Pana dane osobowe przetwarzane będą  z uwagi na Pani/Pana działalność w organizacji studenckiej, ubieganiu się o dofinansowanie na realizację projektów i wykorzystywane będą do celów organizacyjnych, statutowych, archiwalnych, statystycznych.</w:t>
       </w:r>
     </w:p>
-    <w:p>
+    <w:p ns2:paraId="229998DE" ns2:textId="77777777">
       <w:pPr>
         <w:pStyle w:val="gwpa5e667c8gwp3cb86075msonormal"/>
         <w:shd w:val="clear" w:color="auto" w:fill="FFFFFF"/>
@@ -5033,7 +4466,7 @@
         <w:t>przetwarzania Pani/Pana danych stanowi art. 6 ust. 1 lit. b RODO – przetwarzanie jest   niezbędne do ubiegania się o dofinansowanie na działalność organizacji studenckiej.</w:t>
       </w:r>
     </w:p>
-    <w:p>
+    <w:p ns2:paraId="798A33B8" ns2:textId="77777777">
       <w:pPr>
         <w:pStyle w:val="Akapitzlist"/>
         <w:autoSpaceDN w:val="0"/>
@@ -5090,7 +4523,7 @@
         <w:t>6. Odbiorcą Pani/Pana danych osobowych będzie Zachodniopomorski Uniwersytet Technologiczny w Szczecinie, dane nie będą udostępniane podmiotom zewnętrznym z wyjątkiem przypadków przewidzianych przepisami prawa oraz podmiotom trudniącym się windykacją należności finansowych w przypadku nie wywiązania się przez Panią/Pana z odpowiednich obowiązków wynikających z otrzymania dofinansowania na działalność organizacji studenckiej.</w:t>
       </w:r>
     </w:p>
-    <w:p>
+    <w:p ns2:paraId="45EF0717" ns2:textId="77777777">
       <w:pPr>
         <w:pStyle w:val="gwpa5e667c8gwp3cb86075msonormal"/>
         <w:shd w:val="clear" w:color="auto" w:fill="FFFFFF"/>
@@ -5119,7 +4552,7 @@
         <w:t>8. Posiada Pani/Pan:</w:t>
       </w:r>
     </w:p>
-    <w:p>
+    <w:p ns2:paraId="7DEFD0E6" ns2:textId="77777777">
       <w:pPr>
         <w:pStyle w:val="gwpa5e667c8gwp3cb86075msonormal"/>
         <w:shd w:val="clear" w:color="auto" w:fill="FFFFFF"/>
@@ -5139,7 +4572,7 @@
         <w:t xml:space="preserve">- prawo dostępu do treści swoich danych osobowych </w:t>
       </w:r>
     </w:p>
-    <w:p>
+    <w:p ns2:paraId="742DF5B2" ns2:textId="77777777">
       <w:pPr>
         <w:pStyle w:val="gwpa5e667c8gwp3cb86075msonormal"/>
         <w:shd w:val="clear" w:color="auto" w:fill="FFFFFF"/>
@@ -5159,7 +4592,7 @@
         <w:t>- prawo do sprostowania danych osobowych,</w:t>
       </w:r>
     </w:p>
-    <w:p>
+    <w:p ns2:paraId="2237AE78" ns2:textId="77777777">
       <w:pPr>
         <w:pStyle w:val="gwpa5e667c8gwp3cb86075msonormal"/>
         <w:shd w:val="clear" w:color="auto" w:fill="FFFFFF"/>
@@ -5179,7 +4612,7 @@
         <w:t xml:space="preserve">- prawo do usunięcia danych osobowych, </w:t>
       </w:r>
     </w:p>
-    <w:p>
+    <w:p ns2:paraId="4D2CEE5C" ns2:textId="77777777">
       <w:pPr>
         <w:pStyle w:val="gwpa5e667c8gwp3cb86075msonormal"/>
         <w:shd w:val="clear" w:color="auto" w:fill="FFFFFF"/>
@@ -5199,7 +4632,7 @@
         <w:t>- prawo do przenoszenia danych osobowych,</w:t>
       </w:r>
     </w:p>
-    <w:p>
+    <w:p ns2:paraId="4FC1252D" ns2:textId="77777777">
       <w:pPr>
         <w:pStyle w:val="gwpa5e667c8gwp3cb86075msonormal"/>
         <w:shd w:val="clear" w:color="auto" w:fill="FFFFFF"/>
@@ -5219,7 +4652,7 @@
         <w:t xml:space="preserve">- prawo do ograniczenia przetwarzania danych osobowych, </w:t>
       </w:r>
     </w:p>
-    <w:p>
+    <w:p ns2:paraId="3FBBFC73" ns2:textId="77777777">
       <w:pPr>
         <w:pStyle w:val="gwpa5e667c8gwp3cb86075msonormal"/>
         <w:shd w:val="clear" w:color="auto" w:fill="FFFFFF"/>
@@ -5239,7 +4672,7 @@
         <w:t xml:space="preserve">- prawo do przenoszenia danych, </w:t>
       </w:r>
     </w:p>
-    <w:p>
+    <w:p ns2:paraId="29D09E19" ns2:textId="77777777">
       <w:pPr>
         <w:pStyle w:val="gwpa5e667c8gwp3cb86075msonormal"/>
         <w:shd w:val="clear" w:color="auto" w:fill="FFFFFF"/>
@@ -5259,7 +4692,7 @@
         <w:t>- prawo do wniesienia sprzeciwu,</w:t>
       </w:r>
     </w:p>
-    <w:p>
+    <w:p ns2:paraId="434DE226" ns2:textId="77777777">
       <w:pPr>
         <w:pStyle w:val="gwpa5e667c8gwp3cb86075msonormal"/>
         <w:shd w:val="clear" w:color="auto" w:fill="FFFFFF"/>
@@ -5297,7 +4730,7 @@
         <w:t>10. Pani/Pana dane nie będą przetwarzane w sposób zautomatyzowany i nie będą poddawane profilowaniu.</w:t>
       </w:r>
     </w:p>
-    <w:p>
+    <w:p ns2:paraId="1DE9A712" ns2:textId="77777777">
       <w:pPr>
         <w:pStyle w:val="gwpa5e667c8gwp3cb86075msonormal"/>
         <w:shd w:val="clear" w:color="auto" w:fill="FFFFFF"/>
@@ -5317,7 +4750,7 @@
         <w:t>11. Podanie przez Panią/Pana danych osobowych jest warunkiem realizacji celu. Niepodanie danych w zakresie wymaganym przeze administratora skutkuje niemożnością realizacji celu przetwarzania.</w:t>
       </w:r>
     </w:p>
-    <w:p>
+    <w:p ns2:paraId="4FE74859" ns2:textId="4B6586C2">
       <w:pPr>
         <w:tabs>
           <w:tab w:val="left" w:pos="1134"/>
@@ -5373,7 +4806,7 @@
         <w:tab/>
       </w:r>
     </w:p>
-    <w:p>
+    <w:p ns2:paraId="76CF53AC" ns2:textId="29EF0479">
       <w:pPr>
         <w:tabs>
           <w:tab w:val="left" w:pos="1134"/>
@@ -5493,7 +4926,7 @@
         <w:t>)</w:t>
       </w:r>
     </w:p>
-    <w:p>
+    <w:p ns2:paraId="6741206F" ns2:textId="77777777">
       <w:pPr>
         <w:tabs>
           <w:tab w:val="left" w:pos="0"/>

</xml_diff>